<commit_message>
Cada sección del informe empieza en página nueva
Co-Authored-By: Claude Opus 5.5 <noreply@anthropic.com>
Claude-Session: https://claude.ai/code/session_01EYd8j6jaTfGGnYZUrfHhtJ
</commit_message>
<xml_diff>
--- a/Angely_Osorio_SO_C2_E133.docx
+++ b/Angely_Osorio_SO_C2_E133.docx
@@ -929,6 +929,7 @@
     <w:p>
       <w:pPr>
         <w:pStyle w:val="Ttulo1"/>
+        <w:pageBreakBefore/>
       </w:pPr>
       <w:r>
         <w:t>Metodología</w:t>
@@ -1376,6 +1377,7 @@
     <w:p>
       <w:pPr>
         <w:pStyle w:val="Ttulo1"/>
+        <w:pageBreakBefore/>
       </w:pPr>
       <w:r>
         <w:t>Factores Propios de las Instalaciones (X)</w:t>
@@ -5996,6 +5998,7 @@
     <w:p>
       <w:pPr>
         <w:pStyle w:val="Ttulo1"/>
+        <w:pageBreakBefore/>
       </w:pPr>
       <w:r>
         <w:t>Factores de Protección (Y)</w:t>
@@ -7636,6 +7639,7 @@
     <w:p>
       <w:pPr>
         <w:pStyle w:val="Ttulo1"/>
+        <w:pageBreakBefore/>
       </w:pPr>
       <w:r>
         <w:lastRenderedPageBreak/>
@@ -9253,6 +9257,7 @@
     <w:p>
       <w:pPr>
         <w:pStyle w:val="Ttulo1"/>
+        <w:pageBreakBefore/>
       </w:pPr>
       <w:r>
         <w:lastRenderedPageBreak/>

</xml_diff>